<commit_message>
feat: add sample phieu_thu document to backend-app samples directory
</commit_message>
<xml_diff>
--- a/backend-app/samples/phieu_thu.docx
+++ b/backend-app/samples/phieu_thu.docx
@@ -92,7 +92,7 @@
             </w:pPr>
             <w:r>
               <w:rPr/>
-              <w:t xml:space="preserve">C�NG TY TNHH GIẢI    TR� HO�NG HẢI</w:t>
+              <w:t xml:space="preserve">{TenNhaHang}</w:t>
             </w:r>
           </w:p>
         </w:tc>
@@ -128,7 +128,7 @@
             </w:pPr>
             <w:r>
               <w:rPr/>
-              <w:t xml:space="preserve">TT HN - TC QUEEN PLAZA    KỲ H�A</w:t>
+              <w:t xml:space="preserve">{SlogenNhaHang}</w:t>
             </w:r>
           </w:p>
         </w:tc>
@@ -164,7 +164,7 @@
             </w:pPr>
             <w:r>
               <w:rPr/>
-              <w:t xml:space="preserve">16A L� Hồng Phong    (nối d�i), P. H�a Hưng, TP.HCM</w:t>
+              <w:t xml:space="preserve">{DiaChiNhaHang}</w:t>
             </w:r>
           </w:p>
         </w:tc>
@@ -270,275 +270,275 @@
             </w:pPr>
             <w:r>
               <w:rPr/>
-              <w:t xml:space="preserve">Ng�y �. Th�ng �.. Năm �..</w:t>
-            </w:r>
-          </w:p>
-        </w:tc>
-        <w:tc>
-          <w:tcPr/>
-          <w:p>
-            <w:pPr>
-              <w:spacing w:lineRule="auto"/>
-            </w:pPr>
-            <w:r>
-              <w:rPr/>
-              <w:t xml:space="preserve">Số phiếu:</w:t>
-            </w:r>
-          </w:p>
-        </w:tc>
-        <w:tc>
-          <w:tcPr/>
-          <w:p/>
-        </w:tc>
-      </w:tr>
-      <w:tr>
-        <w:trPr>
-          <w:cantSplit/>
-          <w:trHeight w:val="375" w:hRule="atLeast"/>
-        </w:trPr>
-        <w:tc>
-          <w:tcPr/>
-          <w:p/>
-        </w:tc>
-        <w:tc>
-          <w:tcPr/>
-          <w:p/>
-        </w:tc>
-        <w:tc>
-          <w:tcPr/>
-          <w:p/>
-        </w:tc>
-        <w:tc>
-          <w:tcPr/>
-          <w:p/>
-        </w:tc>
-        <w:tc>
-          <w:tcPr/>
-          <w:p/>
-        </w:tc>
-        <w:tc>
-          <w:tcPr/>
-          <w:p/>
-        </w:tc>
-        <w:tc>
-          <w:tcPr/>
-          <w:p>
-            <w:pPr>
-              <w:spacing w:lineRule="auto"/>
-            </w:pPr>
-            <w:r>
-              <w:rPr/>
-              <w:t xml:space="preserve">Nợ:</w:t>
-            </w:r>
-          </w:p>
-        </w:tc>
-        <w:tc>
-          <w:tcPr/>
-          <w:p/>
-        </w:tc>
-      </w:tr>
-      <w:tr>
-        <w:trPr>
-          <w:cantSplit/>
-          <w:trHeight w:val="375" w:hRule="atLeast"/>
-        </w:trPr>
-        <w:tc>
-          <w:tcPr/>
-          <w:p/>
-        </w:tc>
-        <w:tc>
-          <w:tcPr/>
-          <w:p/>
-        </w:tc>
-        <w:tc>
-          <w:tcPr/>
-          <w:p/>
-        </w:tc>
-        <w:tc>
-          <w:tcPr/>
-          <w:p/>
-        </w:tc>
-        <w:tc>
-          <w:tcPr/>
-          <w:p/>
-        </w:tc>
-        <w:tc>
-          <w:tcPr/>
-          <w:p/>
-        </w:tc>
-        <w:tc>
-          <w:tcPr/>
-          <w:p>
-            <w:pPr>
-              <w:spacing w:lineRule="auto"/>
-            </w:pPr>
-            <w:r>
-              <w:rPr/>
-              <w:t xml:space="preserve">C�:</w:t>
-            </w:r>
-          </w:p>
-        </w:tc>
-        <w:tc>
-          <w:tcPr/>
-          <w:p/>
-        </w:tc>
-      </w:tr>
-      <w:tr>
-        <w:trPr>
-          <w:cantSplit/>
-          <w:trHeight w:val="375" w:hRule="atLeast"/>
-        </w:trPr>
-        <w:tc>
-          <w:tcPr/>
-          <w:p/>
-        </w:tc>
-        <w:tc>
-          <w:tcPr/>
-          <w:p>
-            <w:pPr>
-              <w:spacing w:lineRule="auto"/>
-            </w:pPr>
-            <w:r>
-              <w:rPr/>
-              <w:t xml:space="preserve">M� Hợp đồng:</w:t>
-            </w:r>
-          </w:p>
-        </w:tc>
-        <w:tc>
-          <w:tcPr/>
-          <w:p/>
-        </w:tc>
-        <w:tc>
-          <w:tcPr/>
-          <w:p/>
-        </w:tc>
-        <w:tc>
-          <w:tcPr/>
-          <w:p/>
-        </w:tc>
-        <w:tc>
-          <w:tcPr/>
-          <w:p/>
-        </w:tc>
-        <w:tc>
-          <w:tcPr/>
-          <w:p/>
-        </w:tc>
-        <w:tc>
-          <w:tcPr/>
-          <w:p/>
-        </w:tc>
-      </w:tr>
-      <w:tr>
-        <w:trPr>
-          <w:cantSplit/>
-          <w:trHeight w:val="375" w:hRule="atLeast"/>
-        </w:trPr>
-        <w:tc>
-          <w:tcPr/>
-          <w:p/>
-        </w:tc>
-        <w:tc>
-          <w:tcPr/>
-          <w:p>
-            <w:pPr>
-              <w:spacing w:lineRule="auto"/>
-            </w:pPr>
-            <w:r>
-              <w:rPr/>
-              <w:t xml:space="preserve">Kh�ch h�ng:</w:t>
-            </w:r>
-          </w:p>
-        </w:tc>
-        <w:tc>
-          <w:tcPr/>
-          <w:p/>
-        </w:tc>
-        <w:tc>
-          <w:tcPr/>
-          <w:p/>
-        </w:tc>
-        <w:tc>
-          <w:tcPr/>
-          <w:p/>
-        </w:tc>
-        <w:tc>
-          <w:tcPr/>
-          <w:p/>
-        </w:tc>
-        <w:tc>
-          <w:tcPr/>
-          <w:p/>
-        </w:tc>
-        <w:tc>
-          <w:tcPr/>
-          <w:p/>
-        </w:tc>
-      </w:tr>
-      <w:tr>
-        <w:trPr>
-          <w:cantSplit/>
-          <w:trHeight w:val="375" w:hRule="atLeast"/>
-        </w:trPr>
-        <w:tc>
-          <w:tcPr/>
-          <w:p/>
-        </w:tc>
-        <w:tc>
-          <w:tcPr/>
-          <w:p>
-            <w:pPr>
-              <w:spacing w:lineRule="auto"/>
-            </w:pPr>
-            <w:r>
-              <w:rPr/>
-              <w:t xml:space="preserve">Địa chỉ:</w:t>
-            </w:r>
-          </w:p>
-        </w:tc>
-        <w:tc>
-          <w:tcPr/>
-          <w:p/>
-        </w:tc>
-        <w:tc>
-          <w:tcPr/>
-          <w:p/>
-        </w:tc>
-        <w:tc>
-          <w:tcPr/>
-          <w:p/>
-        </w:tc>
-        <w:tc>
-          <w:tcPr/>
-          <w:p/>
-        </w:tc>
-        <w:tc>
-          <w:tcPr/>
-          <w:p/>
-        </w:tc>
-        <w:tc>
-          <w:tcPr/>
-          <w:p/>
-        </w:tc>
-      </w:tr>
-      <w:tr>
-        <w:trPr>
-          <w:cantSplit/>
-          <w:trHeight w:val="375" w:hRule="atLeast"/>
-        </w:trPr>
-        <w:tc>
-          <w:tcPr/>
-          <w:p/>
-        </w:tc>
-        <w:tc>
-          <w:tcPr/>
-          <w:p>
-            <w:pPr>
-              <w:spacing w:lineRule="auto"/>
-            </w:pPr>
-            <w:r>
-              <w:rPr/>
-              <w:t xml:space="preserve">L� do nộp tiền:</w:t>
+              <w:t xml:space="preserve">Ngày {NgayThu} Tháng {ThangThu} Năm {NamThu}</w:t>
+            </w:r>
+          </w:p>
+        </w:tc>
+        <w:tc>
+          <w:tcPr/>
+          <w:p>
+            <w:pPr>
+              <w:spacing w:lineRule="auto"/>
+            </w:pPr>
+            <w:r>
+              <w:rPr/>
+              <w:t xml:space="preserve">Số phiếu: {SoPhieu}</w:t>
+            </w:r>
+          </w:p>
+        </w:tc>
+        <w:tc>
+          <w:tcPr/>
+          <w:p/>
+        </w:tc>
+      </w:tr>
+      <w:tr>
+        <w:trPr>
+          <w:cantSplit/>
+          <w:trHeight w:val="375" w:hRule="atLeast"/>
+        </w:trPr>
+        <w:tc>
+          <w:tcPr/>
+          <w:p/>
+        </w:tc>
+        <w:tc>
+          <w:tcPr/>
+          <w:p/>
+        </w:tc>
+        <w:tc>
+          <w:tcPr/>
+          <w:p/>
+        </w:tc>
+        <w:tc>
+          <w:tcPr/>
+          <w:p/>
+        </w:tc>
+        <w:tc>
+          <w:tcPr/>
+          <w:p/>
+        </w:tc>
+        <w:tc>
+          <w:tcPr/>
+          <w:p/>
+        </w:tc>
+        <w:tc>
+          <w:tcPr/>
+          <w:p>
+            <w:pPr>
+              <w:spacing w:lineRule="auto"/>
+            </w:pPr>
+            <w:r>
+              <w:rPr/>
+              <w:t xml:space="preserve">Nợ: {TaiKhoanNo}</w:t>
+            </w:r>
+          </w:p>
+        </w:tc>
+        <w:tc>
+          <w:tcPr/>
+          <w:p/>
+        </w:tc>
+      </w:tr>
+      <w:tr>
+        <w:trPr>
+          <w:cantSplit/>
+          <w:trHeight w:val="375" w:hRule="atLeast"/>
+        </w:trPr>
+        <w:tc>
+          <w:tcPr/>
+          <w:p/>
+        </w:tc>
+        <w:tc>
+          <w:tcPr/>
+          <w:p/>
+        </w:tc>
+        <w:tc>
+          <w:tcPr/>
+          <w:p/>
+        </w:tc>
+        <w:tc>
+          <w:tcPr/>
+          <w:p/>
+        </w:tc>
+        <w:tc>
+          <w:tcPr/>
+          <w:p/>
+        </w:tc>
+        <w:tc>
+          <w:tcPr/>
+          <w:p/>
+        </w:tc>
+        <w:tc>
+          <w:tcPr/>
+          <w:p>
+            <w:pPr>
+              <w:spacing w:lineRule="auto"/>
+            </w:pPr>
+            <w:r>
+              <w:rPr/>
+              <w:t xml:space="preserve">Có: {TaiKhoanCo}</w:t>
+            </w:r>
+          </w:p>
+        </w:tc>
+        <w:tc>
+          <w:tcPr/>
+          <w:p/>
+        </w:tc>
+      </w:tr>
+      <w:tr>
+        <w:trPr>
+          <w:cantSplit/>
+          <w:trHeight w:val="375" w:hRule="atLeast"/>
+        </w:trPr>
+        <w:tc>
+          <w:tcPr/>
+          <w:p/>
+        </w:tc>
+        <w:tc>
+          <w:tcPr/>
+          <w:p>
+            <w:pPr>
+              <w:spacing w:lineRule="auto"/>
+            </w:pPr>
+            <w:r>
+              <w:rPr/>
+              <w:t xml:space="preserve">Mã Hợp đồng: {Sohopdong}</w:t>
+            </w:r>
+          </w:p>
+        </w:tc>
+        <w:tc>
+          <w:tcPr/>
+          <w:p/>
+        </w:tc>
+        <w:tc>
+          <w:tcPr/>
+          <w:p/>
+        </w:tc>
+        <w:tc>
+          <w:tcPr/>
+          <w:p/>
+        </w:tc>
+        <w:tc>
+          <w:tcPr/>
+          <w:p/>
+        </w:tc>
+        <w:tc>
+          <w:tcPr/>
+          <w:p/>
+        </w:tc>
+        <w:tc>
+          <w:tcPr/>
+          <w:p/>
+        </w:tc>
+      </w:tr>
+      <w:tr>
+        <w:trPr>
+          <w:cantSplit/>
+          <w:trHeight w:val="375" w:hRule="atLeast"/>
+        </w:trPr>
+        <w:tc>
+          <w:tcPr/>
+          <w:p/>
+        </w:tc>
+        <w:tc>
+          <w:tcPr/>
+          <w:p>
+            <w:pPr>
+              <w:spacing w:lineRule="auto"/>
+            </w:pPr>
+            <w:r>
+              <w:rPr/>
+              <w:t xml:space="preserve">Khách hàng: {TenKhachHang}</w:t>
+            </w:r>
+          </w:p>
+        </w:tc>
+        <w:tc>
+          <w:tcPr/>
+          <w:p/>
+        </w:tc>
+        <w:tc>
+          <w:tcPr/>
+          <w:p/>
+        </w:tc>
+        <w:tc>
+          <w:tcPr/>
+          <w:p/>
+        </w:tc>
+        <w:tc>
+          <w:tcPr/>
+          <w:p/>
+        </w:tc>
+        <w:tc>
+          <w:tcPr/>
+          <w:p/>
+        </w:tc>
+        <w:tc>
+          <w:tcPr/>
+          <w:p/>
+        </w:tc>
+      </w:tr>
+      <w:tr>
+        <w:trPr>
+          <w:cantSplit/>
+          <w:trHeight w:val="375" w:hRule="atLeast"/>
+        </w:trPr>
+        <w:tc>
+          <w:tcPr/>
+          <w:p/>
+        </w:tc>
+        <w:tc>
+          <w:tcPr/>
+          <w:p>
+            <w:pPr>
+              <w:spacing w:lineRule="auto"/>
+            </w:pPr>
+            <w:r>
+              <w:rPr/>
+              <w:t xml:space="preserve">Địa chỉ: {DiaChi}</w:t>
+            </w:r>
+          </w:p>
+        </w:tc>
+        <w:tc>
+          <w:tcPr/>
+          <w:p/>
+        </w:tc>
+        <w:tc>
+          <w:tcPr/>
+          <w:p/>
+        </w:tc>
+        <w:tc>
+          <w:tcPr/>
+          <w:p/>
+        </w:tc>
+        <w:tc>
+          <w:tcPr/>
+          <w:p/>
+        </w:tc>
+        <w:tc>
+          <w:tcPr/>
+          <w:p/>
+        </w:tc>
+        <w:tc>
+          <w:tcPr/>
+          <w:p/>
+        </w:tc>
+      </w:tr>
+      <w:tr>
+        <w:trPr>
+          <w:cantSplit/>
+          <w:trHeight w:val="375" w:hRule="atLeast"/>
+        </w:trPr>
+        <w:tc>
+          <w:tcPr/>
+          <w:p/>
+        </w:tc>
+        <w:tc>
+          <w:tcPr/>
+          <w:p>
+            <w:pPr>
+              <w:spacing w:lineRule="auto"/>
+            </w:pPr>
+            <w:r>
+              <w:rPr/>
+              <w:t xml:space="preserve">Lý do nộp tiền: {Lydo}</w:t>
             </w:r>
           </w:p>
         </w:tc>
@@ -599,107 +599,107 @@
             </w:pPr>
             <w:r>
               <w:rPr/>
-              <w:t xml:space="preserve">Số tiền:</w:t>
-            </w:r>
-          </w:p>
-        </w:tc>
-        <w:tc>
-          <w:tcPr/>
-          <w:p/>
-        </w:tc>
-        <w:tc>
-          <w:tcPr/>
-          <w:p/>
-        </w:tc>
-        <w:tc>
-          <w:tcPr/>
-          <w:p/>
-        </w:tc>
-        <w:tc>
-          <w:tcPr/>
-          <w:p>
-            <w:pPr>
-              <w:spacing w:lineRule="auto"/>
-            </w:pPr>
-            <w:r>
-              <w:rPr/>
-              <w:t xml:space="preserve">H�nh thức:</w:t>
-            </w:r>
-          </w:p>
-        </w:tc>
-        <w:tc>
-          <w:tcPr/>
-          <w:p/>
-        </w:tc>
-        <w:tc>
-          <w:tcPr/>
-          <w:p/>
-        </w:tc>
-      </w:tr>
-      <w:tr>
-        <w:trPr>
-          <w:cantSplit/>
-          <w:trHeight w:val="375" w:hRule="atLeast"/>
-        </w:trPr>
-        <w:tc>
-          <w:tcPr/>
-          <w:p/>
-        </w:tc>
-        <w:tc>
-          <w:tcPr/>
-          <w:p>
-            <w:pPr>
-              <w:spacing w:lineRule="auto"/>
-            </w:pPr>
-            <w:r>
-              <w:rPr/>
-              <w:t xml:space="preserve">Bằng chữ:</w:t>
-            </w:r>
-          </w:p>
-        </w:tc>
-        <w:tc>
-          <w:tcPr/>
-          <w:p/>
-        </w:tc>
-        <w:tc>
-          <w:tcPr/>
-          <w:p/>
-        </w:tc>
-        <w:tc>
-          <w:tcPr/>
-          <w:p/>
-        </w:tc>
-        <w:tc>
-          <w:tcPr/>
-          <w:p/>
-        </w:tc>
-        <w:tc>
-          <w:tcPr/>
-          <w:p/>
-        </w:tc>
-        <w:tc>
-          <w:tcPr/>
-          <w:p/>
-        </w:tc>
-      </w:tr>
-      <w:tr>
-        <w:trPr>
-          <w:cantSplit/>
-          <w:trHeight w:val="375" w:hRule="atLeast"/>
-        </w:trPr>
-        <w:tc>
-          <w:tcPr/>
-          <w:p/>
-        </w:tc>
-        <w:tc>
-          <w:tcPr/>
-          <w:p>
-            <w:pPr>
-              <w:spacing w:lineRule="auto"/>
-            </w:pPr>
-            <w:r>
-              <w:rPr/>
-              <w:t xml:space="preserve">K�m theo:</w:t>
+              <w:t xml:space="preserve">Số tiền: {Tongtien}</w:t>
+            </w:r>
+          </w:p>
+        </w:tc>
+        <w:tc>
+          <w:tcPr/>
+          <w:p/>
+        </w:tc>
+        <w:tc>
+          <w:tcPr/>
+          <w:p/>
+        </w:tc>
+        <w:tc>
+          <w:tcPr/>
+          <w:p/>
+        </w:tc>
+        <w:tc>
+          <w:tcPr/>
+          <w:p>
+            <w:pPr>
+              <w:spacing w:lineRule="auto"/>
+            </w:pPr>
+            <w:r>
+              <w:rPr/>
+              <w:t xml:space="preserve">Hình thức: {HinhThuc}</w:t>
+            </w:r>
+          </w:p>
+        </w:tc>
+        <w:tc>
+          <w:tcPr/>
+          <w:p/>
+        </w:tc>
+        <w:tc>
+          <w:tcPr/>
+          <w:p/>
+        </w:tc>
+      </w:tr>
+      <w:tr>
+        <w:trPr>
+          <w:cantSplit/>
+          <w:trHeight w:val="375" w:hRule="atLeast"/>
+        </w:trPr>
+        <w:tc>
+          <w:tcPr/>
+          <w:p/>
+        </w:tc>
+        <w:tc>
+          <w:tcPr/>
+          <w:p>
+            <w:pPr>
+              <w:spacing w:lineRule="auto"/>
+            </w:pPr>
+            <w:r>
+              <w:rPr/>
+              <w:t xml:space="preserve">Bằng chữ: {SoTienBangChu}</w:t>
+            </w:r>
+          </w:p>
+        </w:tc>
+        <w:tc>
+          <w:tcPr/>
+          <w:p/>
+        </w:tc>
+        <w:tc>
+          <w:tcPr/>
+          <w:p/>
+        </w:tc>
+        <w:tc>
+          <w:tcPr/>
+          <w:p/>
+        </w:tc>
+        <w:tc>
+          <w:tcPr/>
+          <w:p/>
+        </w:tc>
+        <w:tc>
+          <w:tcPr/>
+          <w:p/>
+        </w:tc>
+        <w:tc>
+          <w:tcPr/>
+          <w:p/>
+        </w:tc>
+      </w:tr>
+      <w:tr>
+        <w:trPr>
+          <w:cantSplit/>
+          <w:trHeight w:val="375" w:hRule="atLeast"/>
+        </w:trPr>
+        <w:tc>
+          <w:tcPr/>
+          <w:p/>
+        </w:tc>
+        <w:tc>
+          <w:tcPr/>
+          <w:p>
+            <w:pPr>
+              <w:spacing w:lineRule="auto"/>
+            </w:pPr>
+            <w:r>
+              <w:rPr/>
+              <w:t xml:space="preserve">Kèm theo: {Kemtheo}</w:t>
             </w:r>
           </w:p>
         </w:tc>

</xml_diff>

<commit_message>
feat: implement document generation service with template support and SQL API integration
</commit_message>
<xml_diff>
--- a/backend-app/samples/phieu_thu.docx
+++ b/backend-app/samples/phieu_thu.docx
@@ -565,7 +565,7 @@
             </w:pPr>
             <w:r>
               <w:rPr/>
-              <w:t xml:space="preserve">�</w:t>
+              <w:t xml:space="preserve">[x]</w:t>
             </w:r>
           </w:p>
         </w:tc>
@@ -745,7 +745,7 @@
             </w:pPr>
             <w:r>
               <w:rPr/>
-              <w:t xml:space="preserve">Gi�m đốc</w:t>
+              <w:t xml:space="preserve">Giám đốc</w:t>
             </w:r>
           </w:p>
         </w:tc>
@@ -759,7 +759,7 @@
             </w:pPr>
             <w:r>
               <w:rPr/>
-              <w:t xml:space="preserve">Kế to�n    trưởng</w:t>
+              <w:t xml:space="preserve">Kế toán    trưởng</w:t>
             </w:r>
           </w:p>
         </w:tc>
@@ -819,7 +819,7 @@
             </w:pPr>
             <w:r>
               <w:rPr/>
-              <w:t xml:space="preserve">K� ghi r� họ t�n</w:t>
+              <w:t xml:space="preserve">Ký ghi rõ họ tên</w:t>
             </w:r>
           </w:p>
         </w:tc>
@@ -833,31 +833,31 @@
             </w:pPr>
             <w:r>
               <w:rPr/>
-              <w:t xml:space="preserve">K� ghi r� họ t�n</w:t>
-            </w:r>
-          </w:p>
-        </w:tc>
-        <w:tc>
-          <w:tcPr/>
-          <w:p>
-            <w:pPr>
-              <w:spacing w:lineRule="auto"/>
-            </w:pPr>
-            <w:r>
-              <w:rPr/>
-              <w:t xml:space="preserve">K� ghi r� họ t�n</w:t>
-            </w:r>
-          </w:p>
-        </w:tc>
-        <w:tc>
-          <w:tcPr/>
-          <w:p>
-            <w:pPr>
-              <w:spacing w:lineRule="auto"/>
-            </w:pPr>
-            <w:r>
-              <w:rPr/>
-              <w:t xml:space="preserve">K� ghi r� họ t�n</w:t>
+              <w:t xml:space="preserve">Ký ghi rõ họ tên</w:t>
+            </w:r>
+          </w:p>
+        </w:tc>
+        <w:tc>
+          <w:tcPr/>
+          <w:p>
+            <w:pPr>
+              <w:spacing w:lineRule="auto"/>
+            </w:pPr>
+            <w:r>
+              <w:rPr/>
+              <w:t xml:space="preserve">Ký ghi rõ họ tên</w:t>
+            </w:r>
+          </w:p>
+        </w:tc>
+        <w:tc>
+          <w:tcPr/>
+          <w:p>
+            <w:pPr>
+              <w:spacing w:lineRule="auto"/>
+            </w:pPr>
+            <w:r>
+              <w:rPr/>
+              <w:t xml:space="preserve">Ký ghi rõ họ tên</w:t>
             </w:r>
           </w:p>
         </w:tc>
@@ -871,7 +871,7 @@
             </w:pPr>
             <w:r>
               <w:rPr/>
-              <w:t xml:space="preserve">K� ghi r� họ t�n</w:t>
+              <w:t xml:space="preserve">Ký ghi rõ họ tên</w:t>
             </w:r>
           </w:p>
         </w:tc>

</xml_diff>

<commit_message>
feat: add phieu_thu.docx template to samples directory
</commit_message>
<xml_diff>
--- a/backend-app/samples/phieu_thu.docx
+++ b/backend-app/samples/phieu_thu.docx
@@ -745,7 +745,7 @@
             </w:pPr>
             <w:r>
               <w:rPr/>
-              <w:t xml:space="preserve">Giám đốc</w:t>
+              <w:t xml:space="preserve">Giám đốc</w:t>
             </w:r>
           </w:p>
         </w:tc>
@@ -759,31 +759,31 @@
             </w:pPr>
             <w:r>
               <w:rPr/>
-              <w:t xml:space="preserve">Kế toán    trưởng</w:t>
-            </w:r>
-          </w:p>
-        </w:tc>
-        <w:tc>
-          <w:tcPr/>
-          <w:p>
-            <w:pPr>
-              <w:spacing w:lineRule="auto"/>
-            </w:pPr>
-            <w:r>
-              <w:rPr/>
-              <w:t xml:space="preserve">Thủ quỹ</w:t>
-            </w:r>
-          </w:p>
-        </w:tc>
-        <w:tc>
-          <w:tcPr/>
-          <w:p>
-            <w:pPr>
-              <w:spacing w:lineRule="auto"/>
-            </w:pPr>
-            <w:r>
-              <w:rPr/>
-              <w:t xml:space="preserve">Người lập phiếu</w:t>
+              <w:t xml:space="preserve">Kế toán trưởng</w:t>
+            </w:r>
+          </w:p>
+        </w:tc>
+        <w:tc>
+          <w:tcPr/>
+          <w:p>
+            <w:pPr>
+              <w:spacing w:lineRule="auto"/>
+            </w:pPr>
+            <w:r>
+              <w:rPr/>
+              <w:t xml:space="preserve">Thủ quỹ</w:t>
+            </w:r>
+          </w:p>
+        </w:tc>
+        <w:tc>
+          <w:tcPr/>
+          <w:p>
+            <w:pPr>
+              <w:spacing w:lineRule="auto"/>
+            </w:pPr>
+            <w:r>
+              <w:rPr/>
+              <w:t xml:space="preserve">Người lập phiếu</w:t>
             </w:r>
           </w:p>
         </w:tc>
@@ -797,29 +797,29 @@
             </w:pPr>
             <w:r>
               <w:rPr/>
-              <w:t xml:space="preserve">Người nộp tiền</w:t>
-            </w:r>
-          </w:p>
-        </w:tc>
-      </w:tr>
-      <w:tr>
-        <w:trPr>
-          <w:cantSplit/>
-          <w:trHeight w:val="375" w:hRule="atLeast"/>
-        </w:trPr>
-        <w:tc>
-          <w:tcPr/>
-          <w:p/>
-        </w:tc>
-        <w:tc>
-          <w:tcPr/>
-          <w:p>
-            <w:pPr>
-              <w:spacing w:lineRule="auto"/>
-            </w:pPr>
-            <w:r>
-              <w:rPr/>
-              <w:t xml:space="preserve">Ký ghi rõ họ tên</w:t>
+              <w:t xml:space="preserve">Người nộp tiền</w:t>
+            </w:r>
+          </w:p>
+        </w:tc>
+      </w:tr>
+      <w:tr>
+        <w:trPr>
+          <w:cantSplit/>
+          <w:trHeight w:val="375" w:hRule="atLeast"/>
+        </w:trPr>
+        <w:tc>
+          <w:tcPr/>
+          <w:p/>
+        </w:tc>
+        <w:tc>
+          <w:tcPr/>
+          <w:p>
+            <w:pPr>
+              <w:spacing w:lineRule="auto"/>
+            </w:pPr>
+            <w:r>
+              <w:rPr/>
+              <w:t xml:space="preserve">Ký ghi rõ họ tên</w:t>
             </w:r>
           </w:p>
         </w:tc>
@@ -833,31 +833,31 @@
             </w:pPr>
             <w:r>
               <w:rPr/>
-              <w:t xml:space="preserve">Ký ghi rõ họ tên</w:t>
-            </w:r>
-          </w:p>
-        </w:tc>
-        <w:tc>
-          <w:tcPr/>
-          <w:p>
-            <w:pPr>
-              <w:spacing w:lineRule="auto"/>
-            </w:pPr>
-            <w:r>
-              <w:rPr/>
-              <w:t xml:space="preserve">Ký ghi rõ họ tên</w:t>
-            </w:r>
-          </w:p>
-        </w:tc>
-        <w:tc>
-          <w:tcPr/>
-          <w:p>
-            <w:pPr>
-              <w:spacing w:lineRule="auto"/>
-            </w:pPr>
-            <w:r>
-              <w:rPr/>
-              <w:t xml:space="preserve">Ký ghi rõ họ tên</w:t>
+              <w:t xml:space="preserve">Ký ghi rõ họ tên</w:t>
+            </w:r>
+          </w:p>
+        </w:tc>
+        <w:tc>
+          <w:tcPr/>
+          <w:p>
+            <w:pPr>
+              <w:spacing w:lineRule="auto"/>
+            </w:pPr>
+            <w:r>
+              <w:rPr/>
+              <w:t xml:space="preserve">Ký ghi rõ họ tên</w:t>
+            </w:r>
+          </w:p>
+        </w:tc>
+        <w:tc>
+          <w:tcPr/>
+          <w:p>
+            <w:pPr>
+              <w:spacing w:lineRule="auto"/>
+            </w:pPr>
+            <w:r>
+              <w:rPr/>
+              <w:t xml:space="preserve">Ký ghi rõ họ tên</w:t>
             </w:r>
           </w:p>
         </w:tc>
@@ -871,7 +871,7 @@
             </w:pPr>
             <w:r>
               <w:rPr/>
-              <w:t xml:space="preserve">Ký ghi rõ họ tên</w:t>
+              <w:t xml:space="preserve">Ký ghi rõ họ tên</w:t>
             </w:r>
           </w:p>
         </w:tc>

</xml_diff>

<commit_message>
feat: add sample phieu_thu document to backend templates
</commit_message>
<xml_diff>
--- a/backend-app/samples/phieu_thu.docx
+++ b/backend-app/samples/phieu_thu.docx
@@ -550,24 +550,6 @@
           <w:tcPr>
             <w:gridSpan w:val="2"/>
           </w:tcPr>
-          <w:p>
-            <w:pPr>
-              <w:spacing w:lineRule="auto"/>
-            </w:pPr>
-            <w:r>
-              <w:rPr/>
-              <w:t xml:space="preserve">Cọc giữ    chỗ</w:t>
-            </w:r>
-          </w:p>
-          <w:p>
-            <w:pPr>
-              <w:spacing w:lineRule="auto"/>
-            </w:pPr>
-            <w:r>
-              <w:rPr/>
-              <w:t xml:space="preserve">[x]</w:t>
-            </w:r>
-          </w:p>
         </w:tc>
         <w:tc>
           <w:tcPr/>

</xml_diff>

<commit_message>
feat: add stored procedures for managing booking deposit records and include sample receipt document template
</commit_message>
<xml_diff>
--- a/backend-app/samples/phieu_thu.docx
+++ b/backend-app/samples/phieu_thu.docx
@@ -287,17 +287,7 @@
               </w:rPr>
             </w:pPr>
             <w:r>
-              <w:rPr>
-                <w:rFonts w:ascii="Times New Roman" w:eastAsia="Times New Roman" w:hAnsi="Times New Roman" w:cs="Times New Roman"/>
-                <w:b/>
-                <w:bCs/>
-                <w:color w:val="000000"/>
-                <w:kern w:val="0"/>
-                <w:sz w:val="26"/>
-                <w:szCs w:val="26"/>
-                <w14:ligatures w14:val="none"/>
-              </w:rPr>
-              <w:t>CÔNG TY TNHH GIẢI TRÍ HOÀNG HẢI</w:t>
+              <w:t>{TenNhaHang}</w:t>
             </w:r>
           </w:p>
         </w:tc>
@@ -595,111 +585,7 @@
               </w:rPr>
             </w:pPr>
             <w:r>
-              <w:rPr>
-                <w:rFonts w:ascii="Times New Roman" w:eastAsia="Times New Roman" w:hAnsi="Times New Roman" w:cs="Times New Roman"/>
-                <w:color w:val="000000"/>
-                <w:kern w:val="0"/>
-                <w:sz w:val="22"/>
-                <w:szCs w:val="22"/>
-                <w14:ligatures w14:val="none"/>
-              </w:rPr>
-              <w:t>16A Lê Hồng Phong (</w:t>
-            </w:r>
-            <w:proofErr w:type="spellStart"/>
-            <w:r>
-              <w:rPr>
-                <w:rFonts w:ascii="Times New Roman" w:eastAsia="Times New Roman" w:hAnsi="Times New Roman" w:cs="Times New Roman"/>
-                <w:color w:val="000000"/>
-                <w:kern w:val="0"/>
-                <w:sz w:val="22"/>
-                <w:szCs w:val="22"/>
-                <w14:ligatures w14:val="none"/>
-              </w:rPr>
-              <w:t>nối</w:t>
-            </w:r>
-            <w:proofErr w:type="spellEnd"/>
-            <w:r>
-              <w:rPr>
-                <w:rFonts w:ascii="Times New Roman" w:eastAsia="Times New Roman" w:hAnsi="Times New Roman" w:cs="Times New Roman"/>
-                <w:color w:val="000000"/>
-                <w:kern w:val="0"/>
-                <w:sz w:val="22"/>
-                <w:szCs w:val="22"/>
-                <w14:ligatures w14:val="none"/>
-              </w:rPr>
-              <w:t xml:space="preserve"> </w:t>
-            </w:r>
-            <w:proofErr w:type="spellStart"/>
-            <w:r>
-              <w:rPr>
-                <w:rFonts w:ascii="Times New Roman" w:eastAsia="Times New Roman" w:hAnsi="Times New Roman" w:cs="Times New Roman"/>
-                <w:color w:val="000000"/>
-                <w:kern w:val="0"/>
-                <w:sz w:val="22"/>
-                <w:szCs w:val="22"/>
-                <w14:ligatures w14:val="none"/>
-              </w:rPr>
-              <w:t>dài</w:t>
-            </w:r>
-            <w:proofErr w:type="spellEnd"/>
-            <w:r>
-              <w:rPr>
-                <w:rFonts w:ascii="Times New Roman" w:eastAsia="Times New Roman" w:hAnsi="Times New Roman" w:cs="Times New Roman"/>
-                <w:color w:val="000000"/>
-                <w:kern w:val="0"/>
-                <w:sz w:val="22"/>
-                <w:szCs w:val="22"/>
-                <w14:ligatures w14:val="none"/>
-              </w:rPr>
-              <w:t xml:space="preserve">), P. </w:t>
-            </w:r>
-            <w:proofErr w:type="spellStart"/>
-            <w:r>
-              <w:rPr>
-                <w:rFonts w:ascii="Times New Roman" w:eastAsia="Times New Roman" w:hAnsi="Times New Roman" w:cs="Times New Roman"/>
-                <w:color w:val="000000"/>
-                <w:kern w:val="0"/>
-                <w:sz w:val="22"/>
-                <w:szCs w:val="22"/>
-                <w14:ligatures w14:val="none"/>
-              </w:rPr>
-              <w:t>Hòa</w:t>
-            </w:r>
-            <w:proofErr w:type="spellEnd"/>
-            <w:r>
-              <w:rPr>
-                <w:rFonts w:ascii="Times New Roman" w:eastAsia="Times New Roman" w:hAnsi="Times New Roman" w:cs="Times New Roman"/>
-                <w:color w:val="000000"/>
-                <w:kern w:val="0"/>
-                <w:sz w:val="22"/>
-                <w:szCs w:val="22"/>
-                <w14:ligatures w14:val="none"/>
-              </w:rPr>
-              <w:t xml:space="preserve"> </w:t>
-            </w:r>
-            <w:proofErr w:type="spellStart"/>
-            <w:r>
-              <w:rPr>
-                <w:rFonts w:ascii="Times New Roman" w:eastAsia="Times New Roman" w:hAnsi="Times New Roman" w:cs="Times New Roman"/>
-                <w:color w:val="000000"/>
-                <w:kern w:val="0"/>
-                <w:sz w:val="22"/>
-                <w:szCs w:val="22"/>
-                <w14:ligatures w14:val="none"/>
-              </w:rPr>
-              <w:t>Hưng</w:t>
-            </w:r>
-            <w:proofErr w:type="spellEnd"/>
-            <w:r>
-              <w:rPr>
-                <w:rFonts w:ascii="Times New Roman" w:eastAsia="Times New Roman" w:hAnsi="Times New Roman" w:cs="Times New Roman"/>
-                <w:color w:val="000000"/>
-                <w:kern w:val="0"/>
-                <w:sz w:val="22"/>
-                <w:szCs w:val="22"/>
-                <w14:ligatures w14:val="none"/>
-              </w:rPr>
-              <w:t>, TP.HCM</w:t>
+              <w:t>{DiaChiNhaHang}</w:t>
             </w:r>
           </w:p>
         </w:tc>
@@ -1184,115 +1070,9 @@
                 <w14:ligatures w14:val="none"/>
               </w:rPr>
             </w:pPr>
-            <w:proofErr w:type="spellStart"/>
-            <w:r>
-              <w:rPr>
-                <w:rFonts w:ascii="Times New Roman" w:eastAsia="Times New Roman" w:hAnsi="Times New Roman" w:cs="Times New Roman"/>
-                <w:color w:val="000000"/>
-                <w:kern w:val="0"/>
-                <w:sz w:val="22"/>
-                <w:szCs w:val="22"/>
-                <w14:ligatures w14:val="none"/>
-              </w:rPr>
-              <w:t>Ngày</w:t>
-            </w:r>
-            <w:proofErr w:type="spellEnd"/>
-            <w:r>
-              <w:rPr>
-                <w:rFonts w:ascii="Times New Roman" w:eastAsia="Times New Roman" w:hAnsi="Times New Roman" w:cs="Times New Roman"/>
-                <w:color w:val="000000"/>
-                <w:kern w:val="0"/>
-                <w:sz w:val="22"/>
-                <w:szCs w:val="22"/>
-                <w14:ligatures w14:val="none"/>
-              </w:rPr>
-              <w:t xml:space="preserve"> …. </w:t>
-            </w:r>
-            <w:proofErr w:type="spellStart"/>
-            <w:r>
-              <w:rPr>
-                <w:rFonts w:ascii="Times New Roman" w:eastAsia="Times New Roman" w:hAnsi="Times New Roman" w:cs="Times New Roman"/>
-                <w:color w:val="000000"/>
-                <w:kern w:val="0"/>
-                <w:sz w:val="22"/>
-                <w:szCs w:val="22"/>
-                <w14:ligatures w14:val="none"/>
-              </w:rPr>
-              <w:t>Tháng</w:t>
-            </w:r>
-            <w:proofErr w:type="spellEnd"/>
-            <w:r>
-              <w:rPr>
-                <w:rFonts w:ascii="Times New Roman" w:eastAsia="Times New Roman" w:hAnsi="Times New Roman" w:cs="Times New Roman"/>
-                <w:color w:val="000000"/>
-                <w:kern w:val="0"/>
-                <w:sz w:val="22"/>
-                <w:szCs w:val="22"/>
-                <w14:ligatures w14:val="none"/>
-              </w:rPr>
-              <w:t xml:space="preserve"> </w:t>
-            </w:r>
-            <w:proofErr w:type="gramStart"/>
-            <w:r>
-              <w:rPr>
-                <w:rFonts w:ascii="Times New Roman" w:eastAsia="Times New Roman" w:hAnsi="Times New Roman" w:cs="Times New Roman"/>
-                <w:color w:val="000000"/>
-                <w:kern w:val="0"/>
-                <w:sz w:val="22"/>
-                <w:szCs w:val="22"/>
-                <w14:ligatures w14:val="none"/>
-              </w:rPr>
-              <w:t>…..</w:t>
-            </w:r>
-            <w:proofErr w:type="gramEnd"/>
-            <w:r>
-              <w:rPr>
-                <w:rFonts w:ascii="Times New Roman" w:eastAsia="Times New Roman" w:hAnsi="Times New Roman" w:cs="Times New Roman"/>
-                <w:color w:val="000000"/>
-                <w:kern w:val="0"/>
-                <w:sz w:val="22"/>
-                <w:szCs w:val="22"/>
-                <w14:ligatures w14:val="none"/>
-              </w:rPr>
-              <w:t xml:space="preserve"> </w:t>
-            </w:r>
-            <w:proofErr w:type="spellStart"/>
-            <w:r>
-              <w:rPr>
-                <w:rFonts w:ascii="Times New Roman" w:eastAsia="Times New Roman" w:hAnsi="Times New Roman" w:cs="Times New Roman"/>
-                <w:color w:val="000000"/>
-                <w:kern w:val="0"/>
-                <w:sz w:val="22"/>
-                <w:szCs w:val="22"/>
-                <w14:ligatures w14:val="none"/>
-              </w:rPr>
-              <w:t>Năm</w:t>
-            </w:r>
-            <w:proofErr w:type="spellEnd"/>
-            <w:r>
-              <w:rPr>
-                <w:rFonts w:ascii="Times New Roman" w:eastAsia="Times New Roman" w:hAnsi="Times New Roman" w:cs="Times New Roman"/>
-                <w:color w:val="000000"/>
-                <w:kern w:val="0"/>
-                <w:sz w:val="22"/>
-                <w:szCs w:val="22"/>
-                <w14:ligatures w14:val="none"/>
-              </w:rPr>
-              <w:t xml:space="preserve"> </w:t>
-            </w:r>
-            <w:proofErr w:type="gramStart"/>
-            <w:r>
-              <w:rPr>
-                <w:rFonts w:ascii="Times New Roman" w:eastAsia="Times New Roman" w:hAnsi="Times New Roman" w:cs="Times New Roman"/>
-                <w:color w:val="000000"/>
-                <w:kern w:val="0"/>
-                <w:sz w:val="22"/>
-                <w:szCs w:val="22"/>
-                <w14:ligatures w14:val="none"/>
-              </w:rPr>
-              <w:t>…..</w:t>
-            </w:r>
-            <w:proofErr w:type="gramEnd"/>
+            <w:r>
+              <w:t>Ngày {NgayThu} Tháng {ThangThu} Năm {NamThu}</w:t>
+            </w:r>
           </w:p>
         </w:tc>
         <w:tc>
@@ -1320,53 +1100,8 @@
                 <w14:ligatures w14:val="none"/>
               </w:rPr>
             </w:pPr>
-            <w:proofErr w:type="spellStart"/>
-            <w:r>
-              <w:rPr>
-                <w:rFonts w:ascii="Times New Roman" w:eastAsia="Times New Roman" w:hAnsi="Times New Roman" w:cs="Times New Roman"/>
-                <w:color w:val="000000"/>
-                <w:kern w:val="0"/>
-                <w:sz w:val="22"/>
-                <w:szCs w:val="22"/>
-                <w14:ligatures w14:val="none"/>
-              </w:rPr>
-              <w:t>Số</w:t>
-            </w:r>
-            <w:proofErr w:type="spellEnd"/>
-            <w:r>
-              <w:rPr>
-                <w:rFonts w:ascii="Times New Roman" w:eastAsia="Times New Roman" w:hAnsi="Times New Roman" w:cs="Times New Roman"/>
-                <w:color w:val="000000"/>
-                <w:kern w:val="0"/>
-                <w:sz w:val="22"/>
-                <w:szCs w:val="22"/>
-                <w14:ligatures w14:val="none"/>
-              </w:rPr>
-              <w:t xml:space="preserve"> </w:t>
-            </w:r>
-            <w:proofErr w:type="spellStart"/>
-            <w:r>
-              <w:rPr>
-                <w:rFonts w:ascii="Times New Roman" w:eastAsia="Times New Roman" w:hAnsi="Times New Roman" w:cs="Times New Roman"/>
-                <w:color w:val="000000"/>
-                <w:kern w:val="0"/>
-                <w:sz w:val="22"/>
-                <w:szCs w:val="22"/>
-                <w14:ligatures w14:val="none"/>
-              </w:rPr>
-              <w:t>phiếu</w:t>
-            </w:r>
-            <w:proofErr w:type="spellEnd"/>
-            <w:r>
-              <w:rPr>
-                <w:rFonts w:ascii="Times New Roman" w:eastAsia="Times New Roman" w:hAnsi="Times New Roman" w:cs="Times New Roman"/>
-                <w:color w:val="000000"/>
-                <w:kern w:val="0"/>
-                <w:sz w:val="22"/>
-                <w:szCs w:val="22"/>
-                <w14:ligatures w14:val="none"/>
-              </w:rPr>
-              <w:t>:</w:t>
+            <w:r>
+              <w:t>Số phiếu: {SoPhieu}</w:t>
             </w:r>
           </w:p>
         </w:tc>
@@ -1583,29 +1318,8 @@
                 <w14:ligatures w14:val="none"/>
               </w:rPr>
             </w:pPr>
-            <w:proofErr w:type="spellStart"/>
-            <w:r>
-              <w:rPr>
-                <w:rFonts w:ascii="Times New Roman" w:eastAsia="Times New Roman" w:hAnsi="Times New Roman" w:cs="Times New Roman"/>
-                <w:color w:val="000000"/>
-                <w:kern w:val="0"/>
-                <w:sz w:val="22"/>
-                <w:szCs w:val="22"/>
-                <w14:ligatures w14:val="none"/>
-              </w:rPr>
-              <w:t>Nợ</w:t>
-            </w:r>
-            <w:proofErr w:type="spellEnd"/>
-            <w:r>
-              <w:rPr>
-                <w:rFonts w:ascii="Times New Roman" w:eastAsia="Times New Roman" w:hAnsi="Times New Roman" w:cs="Times New Roman"/>
-                <w:color w:val="000000"/>
-                <w:kern w:val="0"/>
-                <w:sz w:val="22"/>
-                <w:szCs w:val="22"/>
-                <w14:ligatures w14:val="none"/>
-              </w:rPr>
-              <w:t>:</w:t>
+            <w:r>
+              <w:t>Nợ: {TaiKhoanNo}</w:t>
             </w:r>
           </w:p>
         </w:tc>
@@ -1822,29 +1536,8 @@
                 <w14:ligatures w14:val="none"/>
               </w:rPr>
             </w:pPr>
-            <w:proofErr w:type="spellStart"/>
-            <w:r>
-              <w:rPr>
-                <w:rFonts w:ascii="Times New Roman" w:eastAsia="Times New Roman" w:hAnsi="Times New Roman" w:cs="Times New Roman"/>
-                <w:color w:val="000000"/>
-                <w:kern w:val="0"/>
-                <w:sz w:val="22"/>
-                <w:szCs w:val="22"/>
-                <w14:ligatures w14:val="none"/>
-              </w:rPr>
-              <w:t>Có</w:t>
-            </w:r>
-            <w:proofErr w:type="spellEnd"/>
-            <w:r>
-              <w:rPr>
-                <w:rFonts w:ascii="Times New Roman" w:eastAsia="Times New Roman" w:hAnsi="Times New Roman" w:cs="Times New Roman"/>
-                <w:color w:val="000000"/>
-                <w:kern w:val="0"/>
-                <w:sz w:val="22"/>
-                <w:szCs w:val="22"/>
-                <w14:ligatures w14:val="none"/>
-              </w:rPr>
-              <w:t>:</w:t>
+            <w:r>
+              <w:t>Có: {TaiKhoanCo}</w:t>
             </w:r>
           </w:p>
         </w:tc>
@@ -1931,77 +1624,8 @@
                 <w14:ligatures w14:val="none"/>
               </w:rPr>
             </w:pPr>
-            <w:proofErr w:type="spellStart"/>
-            <w:r>
-              <w:rPr>
-                <w:rFonts w:ascii="Times New Roman" w:eastAsia="Times New Roman" w:hAnsi="Times New Roman" w:cs="Times New Roman"/>
-                <w:color w:val="000000"/>
-                <w:kern w:val="0"/>
-                <w:sz w:val="22"/>
-                <w:szCs w:val="22"/>
-                <w14:ligatures w14:val="none"/>
-              </w:rPr>
-              <w:t>Mã</w:t>
-            </w:r>
-            <w:proofErr w:type="spellEnd"/>
-            <w:r>
-              <w:rPr>
-                <w:rFonts w:ascii="Times New Roman" w:eastAsia="Times New Roman" w:hAnsi="Times New Roman" w:cs="Times New Roman"/>
-                <w:color w:val="000000"/>
-                <w:kern w:val="0"/>
-                <w:sz w:val="22"/>
-                <w:szCs w:val="22"/>
-                <w14:ligatures w14:val="none"/>
-              </w:rPr>
-              <w:t xml:space="preserve"> </w:t>
-            </w:r>
-            <w:proofErr w:type="spellStart"/>
-            <w:r>
-              <w:rPr>
-                <w:rFonts w:ascii="Times New Roman" w:eastAsia="Times New Roman" w:hAnsi="Times New Roman" w:cs="Times New Roman"/>
-                <w:color w:val="000000"/>
-                <w:kern w:val="0"/>
-                <w:sz w:val="22"/>
-                <w:szCs w:val="22"/>
-                <w14:ligatures w14:val="none"/>
-              </w:rPr>
-              <w:t>Hợp</w:t>
-            </w:r>
-            <w:proofErr w:type="spellEnd"/>
-            <w:r>
-              <w:rPr>
-                <w:rFonts w:ascii="Times New Roman" w:eastAsia="Times New Roman" w:hAnsi="Times New Roman" w:cs="Times New Roman"/>
-                <w:color w:val="000000"/>
-                <w:kern w:val="0"/>
-                <w:sz w:val="22"/>
-                <w:szCs w:val="22"/>
-                <w14:ligatures w14:val="none"/>
-              </w:rPr>
-              <w:t xml:space="preserve"> </w:t>
-            </w:r>
-            <w:proofErr w:type="spellStart"/>
-            <w:r>
-              <w:rPr>
-                <w:rFonts w:ascii="Times New Roman" w:eastAsia="Times New Roman" w:hAnsi="Times New Roman" w:cs="Times New Roman"/>
-                <w:color w:val="000000"/>
-                <w:kern w:val="0"/>
-                <w:sz w:val="22"/>
-                <w:szCs w:val="22"/>
-                <w14:ligatures w14:val="none"/>
-              </w:rPr>
-              <w:t>đồng</w:t>
-            </w:r>
-            <w:proofErr w:type="spellEnd"/>
-            <w:r>
-              <w:rPr>
-                <w:rFonts w:ascii="Times New Roman" w:eastAsia="Times New Roman" w:hAnsi="Times New Roman" w:cs="Times New Roman"/>
-                <w:color w:val="000000"/>
-                <w:kern w:val="0"/>
-                <w:sz w:val="22"/>
-                <w:szCs w:val="22"/>
-                <w14:ligatures w14:val="none"/>
-              </w:rPr>
-              <w:t>:</w:t>
+            <w:r>
+              <w:t>Mã Hợp đồng: {Sohopdong}</w:t>
             </w:r>
           </w:p>
         </w:tc>
@@ -2218,53 +1842,8 @@
                 <w14:ligatures w14:val="none"/>
               </w:rPr>
             </w:pPr>
-            <w:proofErr w:type="spellStart"/>
-            <w:r>
-              <w:rPr>
-                <w:rFonts w:ascii="Times New Roman" w:eastAsia="Times New Roman" w:hAnsi="Times New Roman" w:cs="Times New Roman"/>
-                <w:color w:val="000000"/>
-                <w:kern w:val="0"/>
-                <w:sz w:val="22"/>
-                <w:szCs w:val="22"/>
-                <w14:ligatures w14:val="none"/>
-              </w:rPr>
-              <w:t>Khách</w:t>
-            </w:r>
-            <w:proofErr w:type="spellEnd"/>
-            <w:r>
-              <w:rPr>
-                <w:rFonts w:ascii="Times New Roman" w:eastAsia="Times New Roman" w:hAnsi="Times New Roman" w:cs="Times New Roman"/>
-                <w:color w:val="000000"/>
-                <w:kern w:val="0"/>
-                <w:sz w:val="22"/>
-                <w:szCs w:val="22"/>
-                <w14:ligatures w14:val="none"/>
-              </w:rPr>
-              <w:t xml:space="preserve"> </w:t>
-            </w:r>
-            <w:proofErr w:type="spellStart"/>
-            <w:r>
-              <w:rPr>
-                <w:rFonts w:ascii="Times New Roman" w:eastAsia="Times New Roman" w:hAnsi="Times New Roman" w:cs="Times New Roman"/>
-                <w:color w:val="000000"/>
-                <w:kern w:val="0"/>
-                <w:sz w:val="22"/>
-                <w:szCs w:val="22"/>
-                <w14:ligatures w14:val="none"/>
-              </w:rPr>
-              <w:t>hàng</w:t>
-            </w:r>
-            <w:proofErr w:type="spellEnd"/>
-            <w:r>
-              <w:rPr>
-                <w:rFonts w:ascii="Times New Roman" w:eastAsia="Times New Roman" w:hAnsi="Times New Roman" w:cs="Times New Roman"/>
-                <w:color w:val="000000"/>
-                <w:kern w:val="0"/>
-                <w:sz w:val="22"/>
-                <w:szCs w:val="22"/>
-                <w14:ligatures w14:val="none"/>
-              </w:rPr>
-              <w:t>:</w:t>
+            <w:r>
+              <w:t>Khách hàng: {Nguoinop}</w:t>
             </w:r>
           </w:p>
         </w:tc>
@@ -2481,53 +2060,8 @@
                 <w14:ligatures w14:val="none"/>
               </w:rPr>
             </w:pPr>
-            <w:proofErr w:type="spellStart"/>
-            <w:r>
-              <w:rPr>
-                <w:rFonts w:ascii="Times New Roman" w:eastAsia="Times New Roman" w:hAnsi="Times New Roman" w:cs="Times New Roman"/>
-                <w:color w:val="000000"/>
-                <w:kern w:val="0"/>
-                <w:sz w:val="22"/>
-                <w:szCs w:val="22"/>
-                <w14:ligatures w14:val="none"/>
-              </w:rPr>
-              <w:t>Địa</w:t>
-            </w:r>
-            <w:proofErr w:type="spellEnd"/>
-            <w:r>
-              <w:rPr>
-                <w:rFonts w:ascii="Times New Roman" w:eastAsia="Times New Roman" w:hAnsi="Times New Roman" w:cs="Times New Roman"/>
-                <w:color w:val="000000"/>
-                <w:kern w:val="0"/>
-                <w:sz w:val="22"/>
-                <w:szCs w:val="22"/>
-                <w14:ligatures w14:val="none"/>
-              </w:rPr>
-              <w:t xml:space="preserve"> </w:t>
-            </w:r>
-            <w:proofErr w:type="spellStart"/>
-            <w:r>
-              <w:rPr>
-                <w:rFonts w:ascii="Times New Roman" w:eastAsia="Times New Roman" w:hAnsi="Times New Roman" w:cs="Times New Roman"/>
-                <w:color w:val="000000"/>
-                <w:kern w:val="0"/>
-                <w:sz w:val="22"/>
-                <w:szCs w:val="22"/>
-                <w14:ligatures w14:val="none"/>
-              </w:rPr>
-              <w:t>chỉ</w:t>
-            </w:r>
-            <w:proofErr w:type="spellEnd"/>
-            <w:r>
-              <w:rPr>
-                <w:rFonts w:ascii="Times New Roman" w:eastAsia="Times New Roman" w:hAnsi="Times New Roman" w:cs="Times New Roman"/>
-                <w:color w:val="000000"/>
-                <w:kern w:val="0"/>
-                <w:sz w:val="22"/>
-                <w:szCs w:val="22"/>
-                <w14:ligatures w14:val="none"/>
-              </w:rPr>
-              <w:t>:</w:t>
+            <w:r>
+              <w:t>Địa chỉ: {DiaChi}</w:t>
             </w:r>
           </w:p>
         </w:tc>
@@ -2745,63 +2279,7 @@
               </w:rPr>
             </w:pPr>
             <w:r>
-              <w:rPr>
-                <w:rFonts w:ascii="Times New Roman" w:eastAsia="Times New Roman" w:hAnsi="Times New Roman" w:cs="Times New Roman"/>
-                <w:color w:val="000000"/>
-                <w:kern w:val="0"/>
-                <w:sz w:val="22"/>
-                <w:szCs w:val="22"/>
-                <w14:ligatures w14:val="none"/>
-              </w:rPr>
-              <w:t xml:space="preserve">Lý do </w:t>
-            </w:r>
-            <w:proofErr w:type="spellStart"/>
-            <w:r>
-              <w:rPr>
-                <w:rFonts w:ascii="Times New Roman" w:eastAsia="Times New Roman" w:hAnsi="Times New Roman" w:cs="Times New Roman"/>
-                <w:color w:val="000000"/>
-                <w:kern w:val="0"/>
-                <w:sz w:val="22"/>
-                <w:szCs w:val="22"/>
-                <w14:ligatures w14:val="none"/>
-              </w:rPr>
-              <w:t>nộp</w:t>
-            </w:r>
-            <w:proofErr w:type="spellEnd"/>
-            <w:r>
-              <w:rPr>
-                <w:rFonts w:ascii="Times New Roman" w:eastAsia="Times New Roman" w:hAnsi="Times New Roman" w:cs="Times New Roman"/>
-                <w:color w:val="000000"/>
-                <w:kern w:val="0"/>
-                <w:sz w:val="22"/>
-                <w:szCs w:val="22"/>
-                <w14:ligatures w14:val="none"/>
-              </w:rPr>
-              <w:t xml:space="preserve"> </w:t>
-            </w:r>
-            <w:proofErr w:type="spellStart"/>
-            <w:r>
-              <w:rPr>
-                <w:rFonts w:ascii="Times New Roman" w:eastAsia="Times New Roman" w:hAnsi="Times New Roman" w:cs="Times New Roman"/>
-                <w:color w:val="000000"/>
-                <w:kern w:val="0"/>
-                <w:sz w:val="22"/>
-                <w:szCs w:val="22"/>
-                <w14:ligatures w14:val="none"/>
-              </w:rPr>
-              <w:t>tiền</w:t>
-            </w:r>
-            <w:proofErr w:type="spellEnd"/>
-            <w:r>
-              <w:rPr>
-                <w:rFonts w:ascii="Times New Roman" w:eastAsia="Times New Roman" w:hAnsi="Times New Roman" w:cs="Times New Roman"/>
-                <w:color w:val="000000"/>
-                <w:kern w:val="0"/>
-                <w:sz w:val="22"/>
-                <w:szCs w:val="22"/>
-                <w14:ligatures w14:val="none"/>
-              </w:rPr>
-              <w:t>:</w:t>
+              <w:t>Lý do nộp tiền:</w:t>
             </w:r>
           </w:p>
         </w:tc>
@@ -2858,77 +2336,8 @@
                 <w14:ligatures w14:val="none"/>
               </w:rPr>
             </w:pPr>
-            <w:proofErr w:type="spellStart"/>
-            <w:r>
-              <w:rPr>
-                <w:rFonts w:ascii="Times New Roman" w:eastAsia="Times New Roman" w:hAnsi="Times New Roman" w:cs="Times New Roman"/>
-                <w:color w:val="000000"/>
-                <w:kern w:val="0"/>
-                <w:sz w:val="22"/>
-                <w:szCs w:val="22"/>
-                <w14:ligatures w14:val="none"/>
-              </w:rPr>
-              <w:t>Cọc</w:t>
-            </w:r>
-            <w:proofErr w:type="spellEnd"/>
-            <w:r>
-              <w:rPr>
-                <w:rFonts w:ascii="Times New Roman" w:eastAsia="Times New Roman" w:hAnsi="Times New Roman" w:cs="Times New Roman"/>
-                <w:color w:val="000000"/>
-                <w:kern w:val="0"/>
-                <w:sz w:val="22"/>
-                <w:szCs w:val="22"/>
-                <w14:ligatures w14:val="none"/>
-              </w:rPr>
-              <w:t xml:space="preserve"> </w:t>
-            </w:r>
-            <w:proofErr w:type="spellStart"/>
-            <w:r>
-              <w:rPr>
-                <w:rFonts w:ascii="Times New Roman" w:eastAsia="Times New Roman" w:hAnsi="Times New Roman" w:cs="Times New Roman"/>
-                <w:color w:val="000000"/>
-                <w:kern w:val="0"/>
-                <w:sz w:val="22"/>
-                <w:szCs w:val="22"/>
-                <w14:ligatures w14:val="none"/>
-              </w:rPr>
-              <w:t>giữ</w:t>
-            </w:r>
-            <w:proofErr w:type="spellEnd"/>
-            <w:r>
-              <w:rPr>
-                <w:rFonts w:ascii="Times New Roman" w:eastAsia="Times New Roman" w:hAnsi="Times New Roman" w:cs="Times New Roman"/>
-                <w:color w:val="000000"/>
-                <w:kern w:val="0"/>
-                <w:sz w:val="22"/>
-                <w:szCs w:val="22"/>
-                <w14:ligatures w14:val="none"/>
-              </w:rPr>
-              <w:t xml:space="preserve"> </w:t>
-            </w:r>
-            <w:proofErr w:type="spellStart"/>
-            <w:r>
-              <w:rPr>
-                <w:rFonts w:ascii="Times New Roman" w:eastAsia="Times New Roman" w:hAnsi="Times New Roman" w:cs="Times New Roman"/>
-                <w:color w:val="000000"/>
-                <w:kern w:val="0"/>
-                <w:sz w:val="22"/>
-                <w:szCs w:val="22"/>
-                <w14:ligatures w14:val="none"/>
-              </w:rPr>
-              <w:t>chỗ</w:t>
-            </w:r>
-            <w:proofErr w:type="spellEnd"/>
-            <w:r>
-              <w:rPr>
-                <w:rFonts w:ascii="Times New Roman" w:eastAsia="Times New Roman" w:hAnsi="Times New Roman" w:cs="Times New Roman"/>
-                <w:color w:val="000000"/>
-                <w:kern w:val="0"/>
-                <w:sz w:val="22"/>
-                <w:szCs w:val="22"/>
-                <w14:ligatures w14:val="none"/>
-              </w:rPr>
-              <w:t xml:space="preserve"> </w:t>
+            <w:r>
+              <w:t>{Lydo}</w:t>
             </w:r>
           </w:p>
         </w:tc>
@@ -3067,53 +2476,8 @@
                 <w14:ligatures w14:val="none"/>
               </w:rPr>
             </w:pPr>
-            <w:proofErr w:type="spellStart"/>
-            <w:r>
-              <w:rPr>
-                <w:rFonts w:ascii="Times New Roman" w:eastAsia="Times New Roman" w:hAnsi="Times New Roman" w:cs="Times New Roman"/>
-                <w:color w:val="000000"/>
-                <w:kern w:val="0"/>
-                <w:sz w:val="22"/>
-                <w:szCs w:val="22"/>
-                <w14:ligatures w14:val="none"/>
-              </w:rPr>
-              <w:t>Số</w:t>
-            </w:r>
-            <w:proofErr w:type="spellEnd"/>
-            <w:r>
-              <w:rPr>
-                <w:rFonts w:ascii="Times New Roman" w:eastAsia="Times New Roman" w:hAnsi="Times New Roman" w:cs="Times New Roman"/>
-                <w:color w:val="000000"/>
-                <w:kern w:val="0"/>
-                <w:sz w:val="22"/>
-                <w:szCs w:val="22"/>
-                <w14:ligatures w14:val="none"/>
-              </w:rPr>
-              <w:t xml:space="preserve"> </w:t>
-            </w:r>
-            <w:proofErr w:type="spellStart"/>
-            <w:r>
-              <w:rPr>
-                <w:rFonts w:ascii="Times New Roman" w:eastAsia="Times New Roman" w:hAnsi="Times New Roman" w:cs="Times New Roman"/>
-                <w:color w:val="000000"/>
-                <w:kern w:val="0"/>
-                <w:sz w:val="22"/>
-                <w:szCs w:val="22"/>
-                <w14:ligatures w14:val="none"/>
-              </w:rPr>
-              <w:t>tiền</w:t>
-            </w:r>
-            <w:proofErr w:type="spellEnd"/>
-            <w:r>
-              <w:rPr>
-                <w:rFonts w:ascii="Times New Roman" w:eastAsia="Times New Roman" w:hAnsi="Times New Roman" w:cs="Times New Roman"/>
-                <w:color w:val="000000"/>
-                <w:kern w:val="0"/>
-                <w:sz w:val="22"/>
-                <w:szCs w:val="22"/>
-                <w14:ligatures w14:val="none"/>
-              </w:rPr>
-              <w:t>:</w:t>
+            <w:r>
+              <w:t>Số tiền: {Tongtien}</w:t>
             </w:r>
           </w:p>
         </w:tc>
@@ -3221,53 +2585,8 @@
                 <w14:ligatures w14:val="none"/>
               </w:rPr>
             </w:pPr>
-            <w:proofErr w:type="spellStart"/>
-            <w:r>
-              <w:rPr>
-                <w:rFonts w:ascii="Times New Roman" w:eastAsia="Times New Roman" w:hAnsi="Times New Roman" w:cs="Times New Roman"/>
-                <w:color w:val="000000"/>
-                <w:kern w:val="0"/>
-                <w:sz w:val="22"/>
-                <w:szCs w:val="22"/>
-                <w14:ligatures w14:val="none"/>
-              </w:rPr>
-              <w:t>Hình</w:t>
-            </w:r>
-            <w:proofErr w:type="spellEnd"/>
-            <w:r>
-              <w:rPr>
-                <w:rFonts w:ascii="Times New Roman" w:eastAsia="Times New Roman" w:hAnsi="Times New Roman" w:cs="Times New Roman"/>
-                <w:color w:val="000000"/>
-                <w:kern w:val="0"/>
-                <w:sz w:val="22"/>
-                <w:szCs w:val="22"/>
-                <w14:ligatures w14:val="none"/>
-              </w:rPr>
-              <w:t xml:space="preserve"> </w:t>
-            </w:r>
-            <w:proofErr w:type="spellStart"/>
-            <w:r>
-              <w:rPr>
-                <w:rFonts w:ascii="Times New Roman" w:eastAsia="Times New Roman" w:hAnsi="Times New Roman" w:cs="Times New Roman"/>
-                <w:color w:val="000000"/>
-                <w:kern w:val="0"/>
-                <w:sz w:val="22"/>
-                <w:szCs w:val="22"/>
-                <w14:ligatures w14:val="none"/>
-              </w:rPr>
-              <w:t>thức</w:t>
-            </w:r>
-            <w:proofErr w:type="spellEnd"/>
-            <w:r>
-              <w:rPr>
-                <w:rFonts w:ascii="Times New Roman" w:eastAsia="Times New Roman" w:hAnsi="Times New Roman" w:cs="Times New Roman"/>
-                <w:color w:val="000000"/>
-                <w:kern w:val="0"/>
-                <w:sz w:val="22"/>
-                <w:szCs w:val="22"/>
-                <w14:ligatures w14:val="none"/>
-              </w:rPr>
-              <w:t>:</w:t>
+            <w:r>
+              <w:t>Hình thức: {HinhThuc}</w:t>
             </w:r>
           </w:p>
         </w:tc>
@@ -3380,53 +2699,8 @@
                 <w14:ligatures w14:val="none"/>
               </w:rPr>
             </w:pPr>
-            <w:proofErr w:type="spellStart"/>
-            <w:r>
-              <w:rPr>
-                <w:rFonts w:ascii="Times New Roman" w:eastAsia="Times New Roman" w:hAnsi="Times New Roman" w:cs="Times New Roman"/>
-                <w:color w:val="000000"/>
-                <w:kern w:val="0"/>
-                <w:sz w:val="22"/>
-                <w:szCs w:val="22"/>
-                <w14:ligatures w14:val="none"/>
-              </w:rPr>
-              <w:t>Bằng</w:t>
-            </w:r>
-            <w:proofErr w:type="spellEnd"/>
-            <w:r>
-              <w:rPr>
-                <w:rFonts w:ascii="Times New Roman" w:eastAsia="Times New Roman" w:hAnsi="Times New Roman" w:cs="Times New Roman"/>
-                <w:color w:val="000000"/>
-                <w:kern w:val="0"/>
-                <w:sz w:val="22"/>
-                <w:szCs w:val="22"/>
-                <w14:ligatures w14:val="none"/>
-              </w:rPr>
-              <w:t xml:space="preserve"> </w:t>
-            </w:r>
-            <w:proofErr w:type="spellStart"/>
-            <w:r>
-              <w:rPr>
-                <w:rFonts w:ascii="Times New Roman" w:eastAsia="Times New Roman" w:hAnsi="Times New Roman" w:cs="Times New Roman"/>
-                <w:color w:val="000000"/>
-                <w:kern w:val="0"/>
-                <w:sz w:val="22"/>
-                <w:szCs w:val="22"/>
-                <w14:ligatures w14:val="none"/>
-              </w:rPr>
-              <w:t>chữ</w:t>
-            </w:r>
-            <w:proofErr w:type="spellEnd"/>
-            <w:r>
-              <w:rPr>
-                <w:rFonts w:ascii="Times New Roman" w:eastAsia="Times New Roman" w:hAnsi="Times New Roman" w:cs="Times New Roman"/>
-                <w:color w:val="000000"/>
-                <w:kern w:val="0"/>
-                <w:sz w:val="22"/>
-                <w:szCs w:val="22"/>
-                <w14:ligatures w14:val="none"/>
-              </w:rPr>
-              <w:t>:</w:t>
+            <w:r>
+              <w:t>Bằng chữ: {SoTienBangChu}</w:t>
             </w:r>
           </w:p>
         </w:tc>
@@ -3643,53 +2917,8 @@
                 <w14:ligatures w14:val="none"/>
               </w:rPr>
             </w:pPr>
-            <w:proofErr w:type="spellStart"/>
-            <w:r>
-              <w:rPr>
-                <w:rFonts w:ascii="Times New Roman" w:eastAsia="Times New Roman" w:hAnsi="Times New Roman" w:cs="Times New Roman"/>
-                <w:color w:val="000000"/>
-                <w:kern w:val="0"/>
-                <w:sz w:val="22"/>
-                <w:szCs w:val="22"/>
-                <w14:ligatures w14:val="none"/>
-              </w:rPr>
-              <w:t>Kèm</w:t>
-            </w:r>
-            <w:proofErr w:type="spellEnd"/>
-            <w:r>
-              <w:rPr>
-                <w:rFonts w:ascii="Times New Roman" w:eastAsia="Times New Roman" w:hAnsi="Times New Roman" w:cs="Times New Roman"/>
-                <w:color w:val="000000"/>
-                <w:kern w:val="0"/>
-                <w:sz w:val="22"/>
-                <w:szCs w:val="22"/>
-                <w14:ligatures w14:val="none"/>
-              </w:rPr>
-              <w:t xml:space="preserve"> </w:t>
-            </w:r>
-            <w:proofErr w:type="spellStart"/>
-            <w:r>
-              <w:rPr>
-                <w:rFonts w:ascii="Times New Roman" w:eastAsia="Times New Roman" w:hAnsi="Times New Roman" w:cs="Times New Roman"/>
-                <w:color w:val="000000"/>
-                <w:kern w:val="0"/>
-                <w:sz w:val="22"/>
-                <w:szCs w:val="22"/>
-                <w14:ligatures w14:val="none"/>
-              </w:rPr>
-              <w:t>theo</w:t>
-            </w:r>
-            <w:proofErr w:type="spellEnd"/>
-            <w:r>
-              <w:rPr>
-                <w:rFonts w:ascii="Times New Roman" w:eastAsia="Times New Roman" w:hAnsi="Times New Roman" w:cs="Times New Roman"/>
-                <w:color w:val="000000"/>
-                <w:kern w:val="0"/>
-                <w:sz w:val="22"/>
-                <w:szCs w:val="22"/>
-                <w14:ligatures w14:val="none"/>
-              </w:rPr>
-              <w:t>:</w:t>
+            <w:r>
+              <w:t>Kèm theo: {Kemtheo}</w:t>
             </w:r>
           </w:p>
         </w:tc>

</xml_diff>

<commit_message>
feat: implement dynamic SPA router and add SQL configuration for checkout API endpoints
</commit_message>
<xml_diff>
--- a/backend-app/samples/phieu_thu.docx
+++ b/backend-app/samples/phieu_thu.docx
@@ -287,7 +287,7 @@
               </w:rPr>
             </w:pPr>
             <w:r>
-              <w:t>{TenNhaHang}</w:t>
+              <w:t>{Tên nhà hàng}</w:t>
             </w:r>
           </w:p>
         </w:tc>
@@ -585,7 +585,7 @@
               </w:rPr>
             </w:pPr>
             <w:r>
-              <w:t>{DiaChiNhaHang}</w:t>
+              <w:t>{Địa chỉ nhà hàng}</w:t>
             </w:r>
           </w:p>
         </w:tc>
@@ -1071,7 +1071,7 @@
               </w:rPr>
             </w:pPr>
             <w:r>
-              <w:t>Ngày {NgayThu} Tháng {ThangThu} Năm {NamThu}</w:t>
+              <w:t>Ngày {Ngày} Tháng {Tháng} Năm {Năm}</w:t>
             </w:r>
           </w:p>
         </w:tc>
@@ -1101,7 +1101,7 @@
               </w:rPr>
             </w:pPr>
             <w:r>
-              <w:t>Số phiếu: {SoPhieu}</w:t>
+              <w:t>Số phiếu: {Số phiếu}</w:t>
             </w:r>
           </w:p>
         </w:tc>
@@ -1319,7 +1319,7 @@
               </w:rPr>
             </w:pPr>
             <w:r>
-              <w:t>Nợ: {TaiKhoanNo}</w:t>
+              <w:t>Nợ: {Tài khoản nợ}</w:t>
             </w:r>
           </w:p>
         </w:tc>
@@ -1537,7 +1537,7 @@
               </w:rPr>
             </w:pPr>
             <w:r>
-              <w:t>Có: {TaiKhoanCo}</w:t>
+              <w:t>Có: {Tài khoản có}</w:t>
             </w:r>
           </w:p>
         </w:tc>
@@ -1625,7 +1625,7 @@
               </w:rPr>
             </w:pPr>
             <w:r>
-              <w:t>Mã Hợp đồng: {Sohopdong}</w:t>
+              <w:t>Mã Hợp đồng: {Số hợp đồng}</w:t>
             </w:r>
           </w:p>
         </w:tc>
@@ -1843,7 +1843,7 @@
               </w:rPr>
             </w:pPr>
             <w:r>
-              <w:t>Khách hàng: {Nguoinop}</w:t>
+              <w:t>Khách hàng: {Người nộp}</w:t>
             </w:r>
           </w:p>
         </w:tc>
@@ -2061,7 +2061,7 @@
               </w:rPr>
             </w:pPr>
             <w:r>
-              <w:t>Địa chỉ: {Diachi}</w:t>
+              <w:t>Địa chỉ: {Địa chỉ}</w:t>
             </w:r>
           </w:p>
         </w:tc>
@@ -2337,7 +2337,7 @@
               </w:rPr>
             </w:pPr>
             <w:r>
-              <w:t>{Lydo}</w:t>
+              <w:t>{Lý do}</w:t>
             </w:r>
           </w:p>
         </w:tc>
@@ -2477,7 +2477,7 @@
               </w:rPr>
             </w:pPr>
             <w:r>
-              <w:t>Số tiền: {Tongtien}</w:t>
+              <w:t>Số tiền: {Tổng tiền}</w:t>
             </w:r>
           </w:p>
         </w:tc>
@@ -2586,7 +2586,7 @@
               </w:rPr>
             </w:pPr>
             <w:r>
-              <w:t>Hình thức: {HinhThuc}</w:t>
+              <w:t>Hình thức: {Hình thức}</w:t>
             </w:r>
           </w:p>
         </w:tc>
@@ -2700,7 +2700,7 @@
               </w:rPr>
             </w:pPr>
             <w:r>
-              <w:t>Bằng chữ: {SoTienBangChu}</w:t>
+              <w:t>Bằng chữ: {Số tiền bằng chữ}</w:t>
             </w:r>
           </w:p>
         </w:tc>
@@ -2918,7 +2918,7 @@
               </w:rPr>
             </w:pPr>
             <w:r>
-              <w:t>Kèm theo: {Kemtheo}</w:t>
+              <w:t>Kèm theo: {Kèm theo}</w:t>
             </w:r>
           </w:p>
         </w:tc>

</xml_diff>

<commit_message>
feat: implement stored procedures for booking and settlement data retrieval alongside required templates and UI table components
</commit_message>
<xml_diff>
--- a/backend-app/samples/phieu_thu.docx
+++ b/backend-app/samples/phieu_thu.docx
@@ -287,7 +287,7 @@
               </w:rPr>
             </w:pPr>
             <w:r>
-              <w:t>{Tên nhà hàng}</w:t>
+              <w:t>{TenNhaHang}</w:t>
             </w:r>
           </w:p>
         </w:tc>
@@ -585,7 +585,7 @@
               </w:rPr>
             </w:pPr>
             <w:r>
-              <w:t>{Địa chỉ nhà hàng}</w:t>
+              <w:t>{DiaChiNhaHang}</w:t>
             </w:r>
           </w:p>
         </w:tc>
@@ -1071,7 +1071,7 @@
               </w:rPr>
             </w:pPr>
             <w:r>
-              <w:t>Ngày {Ngày} Tháng {Tháng} Năm {Năm}</w:t>
+              <w:t>Ngày {Ngay} Tháng {Thang} Năm {Nam}</w:t>
             </w:r>
           </w:p>
         </w:tc>
@@ -1101,7 +1101,7 @@
               </w:rPr>
             </w:pPr>
             <w:r>
-              <w:t>Số phiếu: {Số phiếu}</w:t>
+              <w:t>Số phiếu: {SoPhieu}</w:t>
             </w:r>
           </w:p>
         </w:tc>
@@ -1319,7 +1319,7 @@
               </w:rPr>
             </w:pPr>
             <w:r>
-              <w:t>Nợ: {Tài khoản nợ}</w:t>
+              <w:t>Nợ: {TaiKhoanNo}</w:t>
             </w:r>
           </w:p>
         </w:tc>
@@ -1537,7 +1537,7 @@
               </w:rPr>
             </w:pPr>
             <w:r>
-              <w:t>Có: {Tài khoản có}</w:t>
+              <w:t>Có: {TaiKhoanCo}</w:t>
             </w:r>
           </w:p>
         </w:tc>
@@ -1625,7 +1625,7 @@
               </w:rPr>
             </w:pPr>
             <w:r>
-              <w:t>Mã Hợp đồng: {Số hợp đồng}</w:t>
+              <w:t>Mã Hợp đồng: {Sohopdong}</w:t>
             </w:r>
           </w:p>
         </w:tc>
@@ -1843,7 +1843,7 @@
               </w:rPr>
             </w:pPr>
             <w:r>
-              <w:t>Khách hàng: {Người nộp}</w:t>
+              <w:t>Khách hàng: {Nguoinop}</w:t>
             </w:r>
           </w:p>
         </w:tc>
@@ -2061,7 +2061,7 @@
               </w:rPr>
             </w:pPr>
             <w:r>
-              <w:t>Địa chỉ: {Địa chỉ}</w:t>
+              <w:t>Địa chỉ: {Diachi}</w:t>
             </w:r>
           </w:p>
         </w:tc>
@@ -2337,7 +2337,7 @@
               </w:rPr>
             </w:pPr>
             <w:r>
-              <w:t>{Lý do}</w:t>
+              <w:t>{Lydo}</w:t>
             </w:r>
           </w:p>
         </w:tc>
@@ -2477,7 +2477,7 @@
               </w:rPr>
             </w:pPr>
             <w:r>
-              <w:t>Số tiền: {Tổng tiền}</w:t>
+              <w:t>Số tiền: {Tongtien}</w:t>
             </w:r>
           </w:p>
         </w:tc>
@@ -2586,7 +2586,7 @@
               </w:rPr>
             </w:pPr>
             <w:r>
-              <w:t>Hình thức: {Hình thức}</w:t>
+              <w:t>Hình thức: {HinhThuc}</w:t>
             </w:r>
           </w:p>
         </w:tc>
@@ -2700,7 +2700,7 @@
               </w:rPr>
             </w:pPr>
             <w:r>
-              <w:t>Bằng chữ: {Số tiền bằng chữ}</w:t>
+              <w:t>Bằng chữ: {SoTienBangChu}</w:t>
             </w:r>
           </w:p>
         </w:tc>
@@ -2918,7 +2918,7 @@
               </w:rPr>
             </w:pPr>
             <w:r>
-              <w:t>Kèm theo: {Kèm theo}</w:t>
+              <w:t>Kèm theo: {Kemtheo}</w:t>
             </w:r>
           </w:p>
         </w:tc>

</xml_diff>